<commit_message>
Refine HW00 report script links
</commit_message>
<xml_diff>
--- a/00/docs/answer/answer.docx
+++ b/00/docs/answer/answer.docx
@@ -297,7 +297,7 @@
       </w:r>
     </w:p>
     <w:bookmarkEnd w:id="12"/>
-    <w:bookmarkStart w:id="17" w:name="problem-1a公式推导与算法设计"/>
+    <w:bookmarkStart w:id="18" w:name="problem-1a公式推导与算法设计"/>
     <w:p>
       <w:pPr>
         <w:pStyle w:val="Heading1"/>
@@ -321,7 +321,26 @@
         <w:t xml:space="preserve">1(a)：公式推导与算法设计</w:t>
       </w:r>
     </w:p>
-    <w:bookmarkStart w:id="13" w:name="待求问题"/>
+    <w:p>
+      <w:pPr>
+        <w:pStyle w:val="FirstParagraph"/>
+      </w:pPr>
+      <w:r>
+        <w:rPr>
+          <w:rFonts w:hint="eastAsia"/>
+        </w:rPr>
+        <w:t xml:space="preserve">相关脚本：</w:t>
+      </w:r>
+      <w:hyperlink r:id="rId13">
+        <w:r>
+          <w:rPr>
+            <w:rStyle w:val="Hyperlink"/>
+          </w:rPr>
+          <w:t xml:space="preserve">scripts/problem1.py</w:t>
+        </w:r>
+      </w:hyperlink>
+    </w:p>
+    <w:bookmarkStart w:id="14" w:name="待求问题"/>
     <w:p>
       <w:pPr>
         <w:pStyle w:val="Heading2"/>
@@ -364,8 +383,8 @@
         <w:t xml:space="preserve">本小问只讨论公式推导与算法设计，不报告最终数值表。</w:t>
       </w:r>
     </w:p>
-    <w:bookmarkEnd w:id="13"/>
-    <w:bookmarkStart w:id="14" w:name="解决方式"/>
+    <w:bookmarkEnd w:id="14"/>
+    <w:bookmarkStart w:id="15" w:name="解决方式"/>
     <w:p>
       <w:pPr>
         <w:pStyle w:val="Heading2"/>
@@ -1150,8 +1169,8 @@
         <w:t xml:space="preserve">check whether the observed order matches the theoretical order p</w:t>
       </w:r>
     </w:p>
-    <w:bookmarkEnd w:id="14"/>
-    <w:bookmarkStart w:id="15" w:name="问题答案"/>
+    <w:bookmarkEnd w:id="15"/>
+    <w:bookmarkStart w:id="16" w:name="问题答案"/>
     <w:p>
       <w:pPr>
         <w:pStyle w:val="Heading2"/>
@@ -1357,8 +1376,8 @@
         <w:t xml:space="preserve">判断数值实验是否符合理论阶数。</w:t>
       </w:r>
     </w:p>
-    <w:bookmarkEnd w:id="15"/>
-    <w:bookmarkStart w:id="16" w:name="理解"/>
+    <w:bookmarkEnd w:id="16"/>
+    <w:bookmarkStart w:id="17" w:name="分析"/>
     <w:p>
       <w:pPr>
         <w:pStyle w:val="Heading2"/>
@@ -1376,7 +1395,7 @@
         <w:rPr>
           <w:rFonts w:hint="eastAsia"/>
         </w:rPr>
-        <w:t xml:space="preserve">理解</w:t>
+        <w:t xml:space="preserve">分析</w:t>
       </w:r>
     </w:p>
     <w:p>
@@ -1399,9 +1418,9 @@
         <w:t xml:space="preserve">算法设计”的小问。推导必须写在解决方式中，问题答案则给出最终可用的公式或判断准则。伪代码只展示算法逻辑，不替代数学推导，也不展开完整源码。</w:t>
       </w:r>
     </w:p>
-    <w:bookmarkEnd w:id="16"/>
     <w:bookmarkEnd w:id="17"/>
-    <w:bookmarkStart w:id="22" w:name="problem-1b数值结果与误差比较"/>
+    <w:bookmarkEnd w:id="18"/>
+    <w:bookmarkStart w:id="23" w:name="problem-1b数值结果与误差比较"/>
     <w:p>
       <w:pPr>
         <w:pStyle w:val="Heading1"/>
@@ -1425,7 +1444,26 @@
         <w:t xml:space="preserve">1(b)：数值结果与误差比较</w:t>
       </w:r>
     </w:p>
-    <w:bookmarkStart w:id="18" w:name="待求问题-1"/>
+    <w:p>
+      <w:pPr>
+        <w:pStyle w:val="FirstParagraph"/>
+      </w:pPr>
+      <w:r>
+        <w:rPr>
+          <w:rFonts w:hint="eastAsia"/>
+        </w:rPr>
+        <w:t xml:space="preserve">相关脚本：</w:t>
+      </w:r>
+      <w:hyperlink r:id="rId13">
+        <w:r>
+          <w:rPr>
+            <w:rStyle w:val="Hyperlink"/>
+          </w:rPr>
+          <w:t xml:space="preserve">scripts/problem1.py</w:t>
+        </w:r>
+      </w:hyperlink>
+    </w:p>
+    <w:bookmarkStart w:id="19" w:name="待求问题-1"/>
     <w:p>
       <w:pPr>
         <w:pStyle w:val="Heading2"/>
@@ -1457,8 +1495,8 @@
         <w:t xml:space="preserve">使用上一小问得到的算法，计算不同步长下的数值结果，并比较误差是否符合理论收敛阶。</w:t>
       </w:r>
     </w:p>
-    <w:bookmarkEnd w:id="18"/>
-    <w:bookmarkStart w:id="19" w:name="解决方式-1"/>
+    <w:bookmarkEnd w:id="19"/>
+    <w:bookmarkStart w:id="20" w:name="解决方式-1"/>
     <w:p>
       <w:pPr>
         <w:pStyle w:val="Heading2"/>
@@ -1557,8 +1595,8 @@
         <w:t xml:space="preserve">。为了便于比较，表格中同时记录参考误差，并观察步长减半后误差是否约缩小为原来的四分之一。</w:t>
       </w:r>
     </w:p>
-    <w:bookmarkEnd w:id="19"/>
-    <w:bookmarkStart w:id="20" w:name="问题答案-1"/>
+    <w:bookmarkEnd w:id="20"/>
+    <w:bookmarkStart w:id="21" w:name="问题答案-1"/>
     <w:p>
       <w:pPr>
         <w:pStyle w:val="Heading2"/>
@@ -1897,8 +1935,8 @@
         <w:t xml:space="preserve">减半时，误差约变为原来的四分之一，因此该数值结果与二阶方法的理论预期一致。</w:t>
       </w:r>
     </w:p>
-    <w:bookmarkEnd w:id="20"/>
-    <w:bookmarkStart w:id="21" w:name="理解-1"/>
+    <w:bookmarkEnd w:id="21"/>
+    <w:bookmarkStart w:id="22" w:name="分析-1"/>
     <w:p>
       <w:pPr>
         <w:pStyle w:val="Heading2"/>
@@ -1916,7 +1954,7 @@
         <w:rPr>
           <w:rFonts w:hint="eastAsia"/>
         </w:rPr>
-        <w:t xml:space="preserve">理解</w:t>
+        <w:t xml:space="preserve">分析</w:t>
       </w:r>
     </w:p>
     <w:p>
@@ -1930,9 +1968,9 @@
         <w:t xml:space="preserve">本小问以表格和定量比较为中心。若有图像，应放在讨论该图的段落附近。文字结论应直接说明“是否符合预期”，并给出依据，而不是只罗列数值。</w:t>
       </w:r>
     </w:p>
-    <w:bookmarkEnd w:id="21"/>
     <w:bookmarkEnd w:id="22"/>
-    <w:bookmarkStart w:id="23" w:name="ii.-统计检验与对象比较"/>
+    <w:bookmarkEnd w:id="23"/>
+    <w:bookmarkStart w:id="24" w:name="ii.-统计检验与对象比较"/>
     <w:p>
       <w:pPr>
         <w:pStyle w:val="Heading1"/>
@@ -1947,8 +1985,8 @@
         <w:t xml:space="preserve">统计检验与对象比较</w:t>
       </w:r>
     </w:p>
-    <w:bookmarkEnd w:id="23"/>
-    <w:bookmarkStart w:id="28" w:name="problem-2a统计量构造"/>
+    <w:bookmarkEnd w:id="24"/>
+    <w:bookmarkStart w:id="30" w:name="problem-2a统计量构造"/>
     <w:p>
       <w:pPr>
         <w:pStyle w:val="Heading1"/>
@@ -1972,7 +2010,26 @@
         <w:t xml:space="preserve">2(a)：统计量构造</w:t>
       </w:r>
     </w:p>
-    <w:bookmarkStart w:id="24" w:name="待求问题-2"/>
+    <w:p>
+      <w:pPr>
+        <w:pStyle w:val="FirstParagraph"/>
+      </w:pPr>
+      <w:r>
+        <w:rPr>
+          <w:rFonts w:hint="eastAsia"/>
+        </w:rPr>
+        <w:t xml:space="preserve">相关脚本：</w:t>
+      </w:r>
+      <w:hyperlink r:id="rId25">
+        <w:r>
+          <w:rPr>
+            <w:rStyle w:val="Hyperlink"/>
+          </w:rPr>
+          <w:t xml:space="preserve">scripts/problem2.py</w:t>
+        </w:r>
+      </w:hyperlink>
+    </w:p>
+    <w:bookmarkStart w:id="26" w:name="待求问题-2"/>
     <w:p>
       <w:pPr>
         <w:pStyle w:val="Heading2"/>
@@ -2004,8 +2061,8 @@
         <w:t xml:space="preserve">构造一个统计检验，并说明统计量在理论模型成立时应服从的参考分布。</w:t>
       </w:r>
     </w:p>
-    <w:bookmarkEnd w:id="24"/>
-    <w:bookmarkStart w:id="25" w:name="解决方式-2"/>
+    <w:bookmarkEnd w:id="26"/>
+    <w:bookmarkStart w:id="27" w:name="解决方式-2"/>
     <w:p>
       <w:pPr>
         <w:pStyle w:val="Heading2"/>
@@ -2245,8 +2302,8 @@
         <w:t xml:space="preserve">服从相应自由度的卡方分布。统计量落在分布主体区域，说明观测结果与理论模型较一致；若落在极端尾部，则说明模型假设可能不成立。</w:t>
       </w:r>
     </w:p>
-    <w:bookmarkEnd w:id="25"/>
-    <w:bookmarkStart w:id="26" w:name="问题答案-2"/>
+    <w:bookmarkEnd w:id="27"/>
+    <w:bookmarkStart w:id="28" w:name="问题答案-2"/>
     <w:p>
       <w:pPr>
         <w:pStyle w:val="Heading2"/>
@@ -2426,8 +2483,8 @@
         <w:t xml:space="preserve">值过小表示观测频数与理论频数偏离显著。</w:t>
       </w:r>
     </w:p>
-    <w:bookmarkEnd w:id="26"/>
-    <w:bookmarkStart w:id="27" w:name="理解-2"/>
+    <w:bookmarkEnd w:id="28"/>
+    <w:bookmarkStart w:id="29" w:name="分析-2"/>
     <w:p>
       <w:pPr>
         <w:pStyle w:val="Heading2"/>
@@ -2445,7 +2502,7 @@
         <w:rPr>
           <w:rFonts w:hint="eastAsia"/>
         </w:rPr>
-        <w:t xml:space="preserve">理解</w:t>
+        <w:t xml:space="preserve">分析</w:t>
       </w:r>
     </w:p>
     <w:p>
@@ -2468,9 +2525,9 @@
         <w:t xml:space="preserve">值解释为“模型为真的概率”。</w:t>
       </w:r>
     </w:p>
-    <w:bookmarkEnd w:id="27"/>
-    <w:bookmarkEnd w:id="28"/>
-    <w:bookmarkStart w:id="33" w:name="problem-2b多对象比较"/>
+    <w:bookmarkEnd w:id="29"/>
+    <w:bookmarkEnd w:id="30"/>
+    <w:bookmarkStart w:id="35" w:name="problem-2b多对象比较"/>
     <w:p>
       <w:pPr>
         <w:pStyle w:val="Heading1"/>
@@ -2494,7 +2551,26 @@
         <w:t xml:space="preserve">2(b)：多对象比较</w:t>
       </w:r>
     </w:p>
-    <w:bookmarkStart w:id="29" w:name="待求问题-3"/>
+    <w:p>
+      <w:pPr>
+        <w:pStyle w:val="FirstParagraph"/>
+      </w:pPr>
+      <w:r>
+        <w:rPr>
+          <w:rFonts w:hint="eastAsia"/>
+        </w:rPr>
+        <w:t xml:space="preserve">相关脚本：</w:t>
+      </w:r>
+      <w:hyperlink r:id="rId25">
+        <w:r>
+          <w:rPr>
+            <w:rStyle w:val="Hyperlink"/>
+          </w:rPr>
+          <w:t xml:space="preserve">scripts/problem2.py</w:t>
+        </w:r>
+      </w:hyperlink>
+    </w:p>
+    <w:bookmarkStart w:id="31" w:name="待求问题-3"/>
     <w:p>
       <w:pPr>
         <w:pStyle w:val="Heading2"/>
@@ -2526,8 +2602,8 @@
         <w:t xml:space="preserve">将上一小问的统计检验用于多组对象，比较哪些对象通过检验、哪些对象不通过，并解释主要差异。</w:t>
       </w:r>
     </w:p>
-    <w:bookmarkEnd w:id="29"/>
-    <w:bookmarkStart w:id="30" w:name="解决方式-3"/>
+    <w:bookmarkEnd w:id="31"/>
+    <w:bookmarkStart w:id="32" w:name="解决方式-3"/>
     <w:p>
       <w:pPr>
         <w:pStyle w:val="Heading2"/>
@@ -2568,8 +2644,8 @@
         <w:t xml:space="preserve">值和关键诊断信息。</w:t>
       </w:r>
     </w:p>
-    <w:bookmarkEnd w:id="30"/>
-    <w:bookmarkStart w:id="31" w:name="问题答案-3"/>
+    <w:bookmarkEnd w:id="32"/>
+    <w:bookmarkStart w:id="33" w:name="问题答案-3"/>
     <w:p>
       <w:pPr>
         <w:pStyle w:val="Heading2"/>
@@ -2954,8 +3030,8 @@
         <w:t xml:space="preserve">的统计量处于合理范围，但这只说明它们在当前检验设置下没有暴露明显问题。</w:t>
       </w:r>
     </w:p>
-    <w:bookmarkEnd w:id="31"/>
-    <w:bookmarkStart w:id="32" w:name="理解-3"/>
+    <w:bookmarkEnd w:id="33"/>
+    <w:bookmarkStart w:id="34" w:name="分析-3"/>
     <w:p>
       <w:pPr>
         <w:pStyle w:val="Heading2"/>
@@ -2973,7 +3049,7 @@
         <w:rPr>
           <w:rFonts w:hint="eastAsia"/>
         </w:rPr>
-        <w:t xml:space="preserve">理解</w:t>
+        <w:t xml:space="preserve">分析</w:t>
       </w:r>
     </w:p>
     <w:p>
@@ -2987,8 +3063,8 @@
         <w:t xml:space="preserve">多对象比较类小问应避免只给一张表就结束。表格负责呈现证据，正文负责解释证据。若某对象通过了一个弱检验，也只能说明它没有被该检验拒绝，不能据此证明它在所有意义下都可靠。</w:t>
       </w:r>
     </w:p>
-    <w:bookmarkEnd w:id="32"/>
-    <w:bookmarkEnd w:id="33"/>
+    <w:bookmarkEnd w:id="34"/>
+    <w:bookmarkEnd w:id="35"/>
     <w:sectPr>
       <w:footnotePr>
         <w:numRestart w:val="eachSect"/>

</xml_diff>

<commit_message>
Add GitHub script links to HW00 report
</commit_message>
<xml_diff>
--- a/00/docs/answer/answer.docx
+++ b/00/docs/answer/answer.docx
@@ -297,7 +297,7 @@
       </w:r>
     </w:p>
     <w:bookmarkEnd w:id="12"/>
-    <w:bookmarkStart w:id="18" w:name="problem-1a公式推导与算法设计"/>
+    <w:bookmarkStart w:id="19" w:name="problem-1a公式推导与算法设计"/>
     <w:p>
       <w:pPr>
         <w:pStyle w:val="Heading1"/>
@@ -335,12 +335,36 @@
         <w:r>
           <w:rPr>
             <w:rStyle w:val="Hyperlink"/>
+            <w:rFonts w:hint="eastAsia"/>
           </w:rPr>
-          <w:t xml:space="preserve">scripts/problem1.py</w:t>
+          <w:t xml:space="preserve">本地</w:t>
+        </w:r>
+        <w:r>
+          <w:rPr>
+            <w:rStyle w:val="Hyperlink"/>
+          </w:rPr>
+          <w:t xml:space="preserve"> scripts/problem1.py</w:t>
         </w:r>
       </w:hyperlink>
-    </w:p>
-    <w:bookmarkStart w:id="14" w:name="待求问题"/>
+      <w:r>
+        <w:t xml:space="preserve"> </w:t>
+      </w:r>
+      <w:r>
+        <w:t xml:space="preserve">/</w:t>
+      </w:r>
+      <w:r>
+        <w:t xml:space="preserve"> </w:t>
+      </w:r>
+      <w:hyperlink r:id="rId14">
+        <w:r>
+          <w:rPr>
+            <w:rStyle w:val="Hyperlink"/>
+          </w:rPr>
+          <w:t xml:space="preserve">GitHub scripts/problem1.py</w:t>
+        </w:r>
+      </w:hyperlink>
+    </w:p>
+    <w:bookmarkStart w:id="15" w:name="待求问题"/>
     <w:p>
       <w:pPr>
         <w:pStyle w:val="Heading2"/>
@@ -383,8 +407,8 @@
         <w:t xml:space="preserve">本小问只讨论公式推导与算法设计，不报告最终数值表。</w:t>
       </w:r>
     </w:p>
-    <w:bookmarkEnd w:id="14"/>
-    <w:bookmarkStart w:id="15" w:name="解决方式"/>
+    <w:bookmarkEnd w:id="15"/>
+    <w:bookmarkStart w:id="16" w:name="解决方式"/>
     <w:p>
       <w:pPr>
         <w:pStyle w:val="Heading2"/>
@@ -1169,8 +1193,8 @@
         <w:t xml:space="preserve">check whether the observed order matches the theoretical order p</w:t>
       </w:r>
     </w:p>
-    <w:bookmarkEnd w:id="15"/>
-    <w:bookmarkStart w:id="16" w:name="问题答案"/>
+    <w:bookmarkEnd w:id="16"/>
+    <w:bookmarkStart w:id="17" w:name="问题答案"/>
     <w:p>
       <w:pPr>
         <w:pStyle w:val="Heading2"/>
@@ -1376,8 +1400,8 @@
         <w:t xml:space="preserve">判断数值实验是否符合理论阶数。</w:t>
       </w:r>
     </w:p>
-    <w:bookmarkEnd w:id="16"/>
-    <w:bookmarkStart w:id="17" w:name="分析"/>
+    <w:bookmarkEnd w:id="17"/>
+    <w:bookmarkStart w:id="18" w:name="分析"/>
     <w:p>
       <w:pPr>
         <w:pStyle w:val="Heading2"/>
@@ -1418,9 +1442,9 @@
         <w:t xml:space="preserve">算法设计”的小问。推导必须写在解决方式中，问题答案则给出最终可用的公式或判断准则。伪代码只展示算法逻辑，不替代数学推导，也不展开完整源码。</w:t>
       </w:r>
     </w:p>
-    <w:bookmarkEnd w:id="17"/>
     <w:bookmarkEnd w:id="18"/>
-    <w:bookmarkStart w:id="23" w:name="problem-1b数值结果与误差比较"/>
+    <w:bookmarkEnd w:id="19"/>
+    <w:bookmarkStart w:id="24" w:name="problem-1b数值结果与误差比较"/>
     <w:p>
       <w:pPr>
         <w:pStyle w:val="Heading1"/>
@@ -1458,12 +1482,36 @@
         <w:r>
           <w:rPr>
             <w:rStyle w:val="Hyperlink"/>
+            <w:rFonts w:hint="eastAsia"/>
           </w:rPr>
-          <w:t xml:space="preserve">scripts/problem1.py</w:t>
+          <w:t xml:space="preserve">本地</w:t>
+        </w:r>
+        <w:r>
+          <w:rPr>
+            <w:rStyle w:val="Hyperlink"/>
+          </w:rPr>
+          <w:t xml:space="preserve"> scripts/problem1.py</w:t>
         </w:r>
       </w:hyperlink>
-    </w:p>
-    <w:bookmarkStart w:id="19" w:name="待求问题-1"/>
+      <w:r>
+        <w:t xml:space="preserve"> </w:t>
+      </w:r>
+      <w:r>
+        <w:t xml:space="preserve">/</w:t>
+      </w:r>
+      <w:r>
+        <w:t xml:space="preserve"> </w:t>
+      </w:r>
+      <w:hyperlink r:id="rId14">
+        <w:r>
+          <w:rPr>
+            <w:rStyle w:val="Hyperlink"/>
+          </w:rPr>
+          <w:t xml:space="preserve">GitHub scripts/problem1.py</w:t>
+        </w:r>
+      </w:hyperlink>
+    </w:p>
+    <w:bookmarkStart w:id="20" w:name="待求问题-1"/>
     <w:p>
       <w:pPr>
         <w:pStyle w:val="Heading2"/>
@@ -1495,8 +1543,8 @@
         <w:t xml:space="preserve">使用上一小问得到的算法，计算不同步长下的数值结果，并比较误差是否符合理论收敛阶。</w:t>
       </w:r>
     </w:p>
-    <w:bookmarkEnd w:id="19"/>
-    <w:bookmarkStart w:id="20" w:name="解决方式-1"/>
+    <w:bookmarkEnd w:id="20"/>
+    <w:bookmarkStart w:id="21" w:name="解决方式-1"/>
     <w:p>
       <w:pPr>
         <w:pStyle w:val="Heading2"/>
@@ -1595,8 +1643,8 @@
         <w:t xml:space="preserve">。为了便于比较，表格中同时记录参考误差，并观察步长减半后误差是否约缩小为原来的四分之一。</w:t>
       </w:r>
     </w:p>
-    <w:bookmarkEnd w:id="20"/>
-    <w:bookmarkStart w:id="21" w:name="问题答案-1"/>
+    <w:bookmarkEnd w:id="21"/>
+    <w:bookmarkStart w:id="22" w:name="问题答案-1"/>
     <w:p>
       <w:pPr>
         <w:pStyle w:val="Heading2"/>
@@ -1935,8 +1983,8 @@
         <w:t xml:space="preserve">减半时，误差约变为原来的四分之一，因此该数值结果与二阶方法的理论预期一致。</w:t>
       </w:r>
     </w:p>
-    <w:bookmarkEnd w:id="21"/>
-    <w:bookmarkStart w:id="22" w:name="分析-1"/>
+    <w:bookmarkEnd w:id="22"/>
+    <w:bookmarkStart w:id="23" w:name="分析-1"/>
     <w:p>
       <w:pPr>
         <w:pStyle w:val="Heading2"/>
@@ -1968,9 +2016,9 @@
         <w:t xml:space="preserve">本小问以表格和定量比较为中心。若有图像，应放在讨论该图的段落附近。文字结论应直接说明“是否符合预期”，并给出依据，而不是只罗列数值。</w:t>
       </w:r>
     </w:p>
-    <w:bookmarkEnd w:id="22"/>
     <w:bookmarkEnd w:id="23"/>
-    <w:bookmarkStart w:id="24" w:name="ii.-统计检验与对象比较"/>
+    <w:bookmarkEnd w:id="24"/>
+    <w:bookmarkStart w:id="25" w:name="ii.-统计检验与对象比较"/>
     <w:p>
       <w:pPr>
         <w:pStyle w:val="Heading1"/>
@@ -1985,8 +2033,8 @@
         <w:t xml:space="preserve">统计检验与对象比较</w:t>
       </w:r>
     </w:p>
-    <w:bookmarkEnd w:id="24"/>
-    <w:bookmarkStart w:id="30" w:name="problem-2a统计量构造"/>
+    <w:bookmarkEnd w:id="25"/>
+    <w:bookmarkStart w:id="32" w:name="problem-2a统计量构造"/>
     <w:p>
       <w:pPr>
         <w:pStyle w:val="Heading1"/>
@@ -2020,16 +2068,40 @@
         </w:rPr>
         <w:t xml:space="preserve">相关脚本：</w:t>
       </w:r>
-      <w:hyperlink r:id="rId25">
+      <w:hyperlink r:id="rId26">
+        <w:r>
+          <w:rPr>
+            <w:rStyle w:val="Hyperlink"/>
+            <w:rFonts w:hint="eastAsia"/>
+          </w:rPr>
+          <w:t xml:space="preserve">本地</w:t>
+        </w:r>
         <w:r>
           <w:rPr>
             <w:rStyle w:val="Hyperlink"/>
           </w:rPr>
-          <w:t xml:space="preserve">scripts/problem2.py</w:t>
+          <w:t xml:space="preserve"> scripts/problem2.py</w:t>
         </w:r>
       </w:hyperlink>
-    </w:p>
-    <w:bookmarkStart w:id="26" w:name="待求问题-2"/>
+      <w:r>
+        <w:t xml:space="preserve"> </w:t>
+      </w:r>
+      <w:r>
+        <w:t xml:space="preserve">/</w:t>
+      </w:r>
+      <w:r>
+        <w:t xml:space="preserve"> </w:t>
+      </w:r>
+      <w:hyperlink r:id="rId27">
+        <w:r>
+          <w:rPr>
+            <w:rStyle w:val="Hyperlink"/>
+          </w:rPr>
+          <w:t xml:space="preserve">GitHub scripts/problem2.py</w:t>
+        </w:r>
+      </w:hyperlink>
+    </w:p>
+    <w:bookmarkStart w:id="28" w:name="待求问题-2"/>
     <w:p>
       <w:pPr>
         <w:pStyle w:val="Heading2"/>
@@ -2061,8 +2133,8 @@
         <w:t xml:space="preserve">构造一个统计检验，并说明统计量在理论模型成立时应服从的参考分布。</w:t>
       </w:r>
     </w:p>
-    <w:bookmarkEnd w:id="26"/>
-    <w:bookmarkStart w:id="27" w:name="解决方式-2"/>
+    <w:bookmarkEnd w:id="28"/>
+    <w:bookmarkStart w:id="29" w:name="解决方式-2"/>
     <w:p>
       <w:pPr>
         <w:pStyle w:val="Heading2"/>
@@ -2302,8 +2374,8 @@
         <w:t xml:space="preserve">服从相应自由度的卡方分布。统计量落在分布主体区域，说明观测结果与理论模型较一致；若落在极端尾部，则说明模型假设可能不成立。</w:t>
       </w:r>
     </w:p>
-    <w:bookmarkEnd w:id="27"/>
-    <w:bookmarkStart w:id="28" w:name="问题答案-2"/>
+    <w:bookmarkEnd w:id="29"/>
+    <w:bookmarkStart w:id="30" w:name="问题答案-2"/>
     <w:p>
       <w:pPr>
         <w:pStyle w:val="Heading2"/>
@@ -2483,8 +2555,8 @@
         <w:t xml:space="preserve">值过小表示观测频数与理论频数偏离显著。</w:t>
       </w:r>
     </w:p>
-    <w:bookmarkEnd w:id="28"/>
-    <w:bookmarkStart w:id="29" w:name="分析-2"/>
+    <w:bookmarkEnd w:id="30"/>
+    <w:bookmarkStart w:id="31" w:name="分析-2"/>
     <w:p>
       <w:pPr>
         <w:pStyle w:val="Heading2"/>
@@ -2525,9 +2597,9 @@
         <w:t xml:space="preserve">值解释为“模型为真的概率”。</w:t>
       </w:r>
     </w:p>
-    <w:bookmarkEnd w:id="29"/>
-    <w:bookmarkEnd w:id="30"/>
-    <w:bookmarkStart w:id="35" w:name="problem-2b多对象比较"/>
+    <w:bookmarkEnd w:id="31"/>
+    <w:bookmarkEnd w:id="32"/>
+    <w:bookmarkStart w:id="37" w:name="problem-2b多对象比较"/>
     <w:p>
       <w:pPr>
         <w:pStyle w:val="Heading1"/>
@@ -2561,16 +2633,40 @@
         </w:rPr>
         <w:t xml:space="preserve">相关脚本：</w:t>
       </w:r>
-      <w:hyperlink r:id="rId25">
+      <w:hyperlink r:id="rId26">
+        <w:r>
+          <w:rPr>
+            <w:rStyle w:val="Hyperlink"/>
+            <w:rFonts w:hint="eastAsia"/>
+          </w:rPr>
+          <w:t xml:space="preserve">本地</w:t>
+        </w:r>
         <w:r>
           <w:rPr>
             <w:rStyle w:val="Hyperlink"/>
           </w:rPr>
-          <w:t xml:space="preserve">scripts/problem2.py</w:t>
+          <w:t xml:space="preserve"> scripts/problem2.py</w:t>
         </w:r>
       </w:hyperlink>
-    </w:p>
-    <w:bookmarkStart w:id="31" w:name="待求问题-3"/>
+      <w:r>
+        <w:t xml:space="preserve"> </w:t>
+      </w:r>
+      <w:r>
+        <w:t xml:space="preserve">/</w:t>
+      </w:r>
+      <w:r>
+        <w:t xml:space="preserve"> </w:t>
+      </w:r>
+      <w:hyperlink r:id="rId27">
+        <w:r>
+          <w:rPr>
+            <w:rStyle w:val="Hyperlink"/>
+          </w:rPr>
+          <w:t xml:space="preserve">GitHub scripts/problem2.py</w:t>
+        </w:r>
+      </w:hyperlink>
+    </w:p>
+    <w:bookmarkStart w:id="33" w:name="待求问题-3"/>
     <w:p>
       <w:pPr>
         <w:pStyle w:val="Heading2"/>
@@ -2602,8 +2698,8 @@
         <w:t xml:space="preserve">将上一小问的统计检验用于多组对象，比较哪些对象通过检验、哪些对象不通过，并解释主要差异。</w:t>
       </w:r>
     </w:p>
-    <w:bookmarkEnd w:id="31"/>
-    <w:bookmarkStart w:id="32" w:name="解决方式-3"/>
+    <w:bookmarkEnd w:id="33"/>
+    <w:bookmarkStart w:id="34" w:name="解决方式-3"/>
     <w:p>
       <w:pPr>
         <w:pStyle w:val="Heading2"/>
@@ -2644,8 +2740,8 @@
         <w:t xml:space="preserve">值和关键诊断信息。</w:t>
       </w:r>
     </w:p>
-    <w:bookmarkEnd w:id="32"/>
-    <w:bookmarkStart w:id="33" w:name="问题答案-3"/>
+    <w:bookmarkEnd w:id="34"/>
+    <w:bookmarkStart w:id="35" w:name="问题答案-3"/>
     <w:p>
       <w:pPr>
         <w:pStyle w:val="Heading2"/>
@@ -3030,8 +3126,8 @@
         <w:t xml:space="preserve">的统计量处于合理范围，但这只说明它们在当前检验设置下没有暴露明显问题。</w:t>
       </w:r>
     </w:p>
-    <w:bookmarkEnd w:id="33"/>
-    <w:bookmarkStart w:id="34" w:name="分析-3"/>
+    <w:bookmarkEnd w:id="35"/>
+    <w:bookmarkStart w:id="36" w:name="分析-3"/>
     <w:p>
       <w:pPr>
         <w:pStyle w:val="Heading2"/>
@@ -3063,8 +3159,8 @@
         <w:t xml:space="preserve">多对象比较类小问应避免只给一张表就结束。表格负责呈现证据，正文负责解释证据。若某对象通过了一个弱检验，也只能说明它没有被该检验拒绝，不能据此证明它在所有意义下都可靠。</w:t>
       </w:r>
     </w:p>
-    <w:bookmarkEnd w:id="34"/>
-    <w:bookmarkEnd w:id="35"/>
+    <w:bookmarkEnd w:id="36"/>
+    <w:bookmarkEnd w:id="37"/>
     <w:sectPr>
       <w:footnotePr>
         <w:numRestart w:val="eachSect"/>

</xml_diff>

<commit_message>
Freeze native LaTeX report prototypes
</commit_message>
<xml_diff>
--- a/00/docs/answer/answer.docx
+++ b/00/docs/answer/answer.docx
@@ -331,6 +331,15 @@
         </w:rPr>
         <w:t xml:space="preserve">相关脚本：</w:t>
       </w:r>
+    </w:p>
+    <w:p>
+      <w:pPr>
+        <w:pStyle w:val="Compact"/>
+        <w:numPr>
+          <w:ilvl w:val="0"/>
+          <w:numId w:val="1001"/>
+        </w:numPr>
+      </w:pPr>
       <w:hyperlink r:id="rId13">
         <w:r>
           <w:rPr>
@@ -346,15 +355,15 @@
           <w:t xml:space="preserve"> scripts/problem1.py</w:t>
         </w:r>
       </w:hyperlink>
-      <w:r>
-        <w:t xml:space="preserve"> </w:t>
-      </w:r>
-      <w:r>
-        <w:t xml:space="preserve">/</w:t>
-      </w:r>
-      <w:r>
-        <w:t xml:space="preserve"> </w:t>
-      </w:r>
+    </w:p>
+    <w:p>
+      <w:pPr>
+        <w:pStyle w:val="Compact"/>
+        <w:numPr>
+          <w:ilvl w:val="0"/>
+          <w:numId w:val="1001"/>
+        </w:numPr>
+      </w:pPr>
       <w:hyperlink r:id="rId14">
         <w:r>
           <w:rPr>
@@ -1478,6 +1487,15 @@
         </w:rPr>
         <w:t xml:space="preserve">相关脚本：</w:t>
       </w:r>
+    </w:p>
+    <w:p>
+      <w:pPr>
+        <w:pStyle w:val="Compact"/>
+        <w:numPr>
+          <w:ilvl w:val="0"/>
+          <w:numId w:val="1002"/>
+        </w:numPr>
+      </w:pPr>
       <w:hyperlink r:id="rId13">
         <w:r>
           <w:rPr>
@@ -1493,15 +1511,15 @@
           <w:t xml:space="preserve"> scripts/problem1.py</w:t>
         </w:r>
       </w:hyperlink>
-      <w:r>
-        <w:t xml:space="preserve"> </w:t>
-      </w:r>
-      <w:r>
-        <w:t xml:space="preserve">/</w:t>
-      </w:r>
-      <w:r>
-        <w:t xml:space="preserve"> </w:t>
-      </w:r>
+    </w:p>
+    <w:p>
+      <w:pPr>
+        <w:pStyle w:val="Compact"/>
+        <w:numPr>
+          <w:ilvl w:val="0"/>
+          <w:numId w:val="1002"/>
+        </w:numPr>
+      </w:pPr>
       <w:hyperlink r:id="rId14">
         <w:r>
           <w:rPr>
@@ -2068,6 +2086,15 @@
         </w:rPr>
         <w:t xml:space="preserve">相关脚本：</w:t>
       </w:r>
+    </w:p>
+    <w:p>
+      <w:pPr>
+        <w:pStyle w:val="Compact"/>
+        <w:numPr>
+          <w:ilvl w:val="0"/>
+          <w:numId w:val="1003"/>
+        </w:numPr>
+      </w:pPr>
       <w:hyperlink r:id="rId26">
         <w:r>
           <w:rPr>
@@ -2083,15 +2110,15 @@
           <w:t xml:space="preserve"> scripts/problem2.py</w:t>
         </w:r>
       </w:hyperlink>
-      <w:r>
-        <w:t xml:space="preserve"> </w:t>
-      </w:r>
-      <w:r>
-        <w:t xml:space="preserve">/</w:t>
-      </w:r>
-      <w:r>
-        <w:t xml:space="preserve"> </w:t>
-      </w:r>
+    </w:p>
+    <w:p>
+      <w:pPr>
+        <w:pStyle w:val="Compact"/>
+        <w:numPr>
+          <w:ilvl w:val="0"/>
+          <w:numId w:val="1003"/>
+        </w:numPr>
+      </w:pPr>
       <w:hyperlink r:id="rId27">
         <w:r>
           <w:rPr>
@@ -2633,6 +2660,15 @@
         </w:rPr>
         <w:t xml:space="preserve">相关脚本：</w:t>
       </w:r>
+    </w:p>
+    <w:p>
+      <w:pPr>
+        <w:pStyle w:val="Compact"/>
+        <w:numPr>
+          <w:ilvl w:val="0"/>
+          <w:numId w:val="1004"/>
+        </w:numPr>
+      </w:pPr>
       <w:hyperlink r:id="rId26">
         <w:r>
           <w:rPr>
@@ -2648,15 +2684,15 @@
           <w:t xml:space="preserve"> scripts/problem2.py</w:t>
         </w:r>
       </w:hyperlink>
-      <w:r>
-        <w:t xml:space="preserve"> </w:t>
-      </w:r>
-      <w:r>
-        <w:t xml:space="preserve">/</w:t>
-      </w:r>
-      <w:r>
-        <w:t xml:space="preserve"> </w:t>
-      </w:r>
+    </w:p>
+    <w:p>
+      <w:pPr>
+        <w:pStyle w:val="Compact"/>
+        <w:numPr>
+          <w:ilvl w:val="0"/>
+          <w:numId w:val="1004"/>
+        </w:numPr>
+      </w:pPr>
       <w:hyperlink r:id="rId27">
         <w:r>
           <w:rPr>
@@ -3271,8 +3307,123 @@
       </w:pPr>
     </w:lvl>
   </w:abstractNum>
+  <w:abstractNum w:abstractNumId="991">
+    <w:nsid w:val="0000A991"/>
+    <w:multiLevelType w:val="multilevel"/>
+    <w:lvl w:ilvl="0">
+      <w:numFmt w:val="bullet"/>
+      <w:lvlText w:val=""/>
+      <w:lvlJc w:val="left"/>
+      <w:pPr>
+        <w:ind w:left="720" w:hanging="360"/>
+      </w:pPr>
+      <w:rPr>
+        <w:rFonts w:ascii="Symbol" w:hAnsi="Symbol" w:cs="Symbol" w:hint="default"/>
+      </w:rPr>
+    </w:lvl>
+    <w:lvl w:ilvl="1">
+      <w:numFmt w:val="bullet"/>
+      <w:lvlText w:val="o"/>
+      <w:lvlJc w:val="left"/>
+      <w:pPr>
+        <w:ind w:left="1440" w:hanging="360"/>
+      </w:pPr>
+      <w:rPr>
+        <w:rFonts w:ascii="Courier New" w:hAnsi="Courier New" w:cs="Courier New" w:hint="default"/>
+      </w:rPr>
+    </w:lvl>
+    <w:lvl w:ilvl="2">
+      <w:numFmt w:val="bullet"/>
+      <w:lvlText w:val=""/>
+      <w:lvlJc w:val="left"/>
+      <w:pPr>
+        <w:ind w:left="2160" w:hanging="360"/>
+      </w:pPr>
+      <w:rPr>
+        <w:rFonts w:ascii="Wingdings" w:hAnsi="Wingdings" w:cs="Wingdings" w:hint="default"/>
+      </w:rPr>
+    </w:lvl>
+    <w:lvl w:ilvl="3">
+      <w:numFmt w:val="bullet"/>
+      <w:lvlText w:val=""/>
+      <w:lvlJc w:val="left"/>
+      <w:pPr>
+        <w:ind w:left="2880" w:hanging="360"/>
+      </w:pPr>
+      <w:rPr>
+        <w:rFonts w:ascii="Symbol" w:hAnsi="Symbol" w:cs="Symbol" w:hint="default"/>
+      </w:rPr>
+    </w:lvl>
+    <w:lvl w:ilvl="4">
+      <w:numFmt w:val="bullet"/>
+      <w:lvlText w:val="o"/>
+      <w:lvlJc w:val="left"/>
+      <w:pPr>
+        <w:ind w:left="3600" w:hanging="360"/>
+      </w:pPr>
+      <w:rPr>
+        <w:rFonts w:ascii="Courier New" w:hAnsi="Courier New" w:cs="Courier New" w:hint="default"/>
+      </w:rPr>
+    </w:lvl>
+    <w:lvl w:ilvl="5">
+      <w:numFmt w:val="bullet"/>
+      <w:lvlText w:val=""/>
+      <w:lvlJc w:val="left"/>
+      <w:pPr>
+        <w:ind w:left="4320" w:hanging="360"/>
+      </w:pPr>
+      <w:rPr>
+        <w:rFonts w:ascii="Wingdings" w:hAnsi="Wingdings" w:cs="Wingdings" w:hint="default"/>
+      </w:rPr>
+    </w:lvl>
+    <w:lvl w:ilvl="6">
+      <w:numFmt w:val="bullet"/>
+      <w:lvlText w:val=""/>
+      <w:lvlJc w:val="left"/>
+      <w:pPr>
+        <w:ind w:left="5040" w:hanging="360"/>
+      </w:pPr>
+      <w:rPr>
+        <w:rFonts w:ascii="Symbol" w:hAnsi="Symbol" w:cs="Symbol" w:hint="default"/>
+      </w:rPr>
+    </w:lvl>
+    <w:lvl w:ilvl="7">
+      <w:numFmt w:val="bullet"/>
+      <w:lvlText w:val="o"/>
+      <w:lvlJc w:val="left"/>
+      <w:pPr>
+        <w:ind w:left="5760" w:hanging="360"/>
+      </w:pPr>
+      <w:rPr>
+        <w:rFonts w:ascii="Courier New" w:hAnsi="Courier New" w:cs="Courier New" w:hint="default"/>
+      </w:rPr>
+    </w:lvl>
+    <w:lvl w:ilvl="8">
+      <w:numFmt w:val="bullet"/>
+      <w:lvlText w:val=""/>
+      <w:lvlJc w:val="left"/>
+      <w:pPr>
+        <w:ind w:left="6480" w:hanging="360"/>
+      </w:pPr>
+      <w:rPr>
+        <w:rFonts w:ascii="Wingdings" w:hAnsi="Wingdings" w:cs="Wingdings" w:hint="default"/>
+      </w:rPr>
+    </w:lvl>
+  </w:abstractNum>
   <w:num w:numId="1000">
     <w:abstractNumId w:val="990"/>
+  </w:num>
+  <w:num w:numId="1001">
+    <w:abstractNumId w:val="991"/>
+  </w:num>
+  <w:num w:numId="1002">
+    <w:abstractNumId w:val="991"/>
+  </w:num>
+  <w:num w:numId="1003">
+    <w:abstractNumId w:val="991"/>
+  </w:num>
+  <w:num w:numId="1004">
+    <w:abstractNumId w:val="991"/>
   </w:num>
 </w:numbering>
 </file>

</xml_diff>

<commit_message>
Fix homework report subproblem hierarchy
</commit_message>
<xml_diff>
--- a/00/docs/answer/answer.docx
+++ b/00/docs/answer/answer.docx
@@ -281,7 +281,7 @@
         </w:tc>
       </w:tr>
     </w:tbl>
-    <w:bookmarkStart w:id="12" w:name="i.-数值方法误差分析"/>
+    <w:bookmarkStart w:id="24" w:name="i.-数值方法误差分析"/>
     <w:p>
       <w:pPr>
         <w:pStyle w:val="Heading1"/>
@@ -296,17 +296,16 @@
         <w:t xml:space="preserve">数值方法误差分析</w:t>
       </w:r>
     </w:p>
-    <w:bookmarkEnd w:id="12"/>
-    <w:bookmarkStart w:id="19" w:name="problem-1a公式推导与算法设计"/>
-    <w:p>
-      <w:pPr>
-        <w:pStyle w:val="Heading1"/>
+    <w:bookmarkStart w:id="18" w:name="problem-1a公式推导与算法设计"/>
+    <w:p>
+      <w:pPr>
+        <w:pStyle w:val="Heading2"/>
       </w:pPr>
       <w:r>
         <w:rPr>
           <w:rStyle w:val="SectionNumber"/>
         </w:rPr>
-        <w:t xml:space="preserve">1</w:t>
+        <w:t xml:space="preserve">0.1</w:t>
       </w:r>
       <w:r>
         <w:tab/>
@@ -340,7 +339,7 @@
           <w:numId w:val="1001"/>
         </w:numPr>
       </w:pPr>
-      <w:hyperlink r:id="rId13">
+      <w:hyperlink r:id="rId12">
         <w:r>
           <w:rPr>
             <w:rStyle w:val="Hyperlink"/>
@@ -364,7 +363,7 @@
           <w:numId w:val="1001"/>
         </w:numPr>
       </w:pPr>
-      <w:hyperlink r:id="rId14">
+      <w:hyperlink r:id="rId13">
         <w:r>
           <w:rPr>
             <w:rStyle w:val="Hyperlink"/>
@@ -373,16 +372,16 @@
         </w:r>
       </w:hyperlink>
     </w:p>
-    <w:bookmarkStart w:id="15" w:name="待求问题"/>
-    <w:p>
-      <w:pPr>
-        <w:pStyle w:val="Heading2"/>
+    <w:bookmarkStart w:id="14" w:name="待求问题"/>
+    <w:p>
+      <w:pPr>
+        <w:pStyle w:val="Heading3"/>
       </w:pPr>
       <w:r>
         <w:rPr>
           <w:rStyle w:val="SectionNumber"/>
         </w:rPr>
-        <w:t xml:space="preserve">1.1</w:t>
+        <w:t xml:space="preserve">0.1.1</w:t>
       </w:r>
       <w:r>
         <w:tab/>
@@ -416,17 +415,17 @@
         <w:t xml:space="preserve">本小问只讨论公式推导与算法设计，不报告最终数值表。</w:t>
       </w:r>
     </w:p>
-    <w:bookmarkEnd w:id="15"/>
-    <w:bookmarkStart w:id="16" w:name="解决方式"/>
-    <w:p>
-      <w:pPr>
-        <w:pStyle w:val="Heading2"/>
+    <w:bookmarkEnd w:id="14"/>
+    <w:bookmarkStart w:id="15" w:name="解决方式"/>
+    <w:p>
+      <w:pPr>
+        <w:pStyle w:val="Heading3"/>
       </w:pPr>
       <w:r>
         <w:rPr>
           <w:rStyle w:val="SectionNumber"/>
         </w:rPr>
-        <w:t xml:space="preserve">1.2</w:t>
+        <w:t xml:space="preserve">0.1.2</w:t>
       </w:r>
       <w:r>
         <w:tab/>
@@ -1202,17 +1201,17 @@
         <w:t xml:space="preserve">check whether the observed order matches the theoretical order p</w:t>
       </w:r>
     </w:p>
-    <w:bookmarkEnd w:id="16"/>
-    <w:bookmarkStart w:id="17" w:name="问题答案"/>
-    <w:p>
-      <w:pPr>
-        <w:pStyle w:val="Heading2"/>
+    <w:bookmarkEnd w:id="15"/>
+    <w:bookmarkStart w:id="16" w:name="问题答案"/>
+    <w:p>
+      <w:pPr>
+        <w:pStyle w:val="Heading3"/>
       </w:pPr>
       <w:r>
         <w:rPr>
           <w:rStyle w:val="SectionNumber"/>
         </w:rPr>
-        <w:t xml:space="preserve">1.3</w:t>
+        <w:t xml:space="preserve">0.1.3</w:t>
       </w:r>
       <w:r>
         <w:tab/>
@@ -1409,8 +1408,51 @@
         <w:t xml:space="preserve">判断数值实验是否符合理论阶数。</w:t>
       </w:r>
     </w:p>
+    <w:bookmarkEnd w:id="16"/>
+    <w:bookmarkStart w:id="17" w:name="分析"/>
+    <w:p>
+      <w:pPr>
+        <w:pStyle w:val="Heading3"/>
+      </w:pPr>
+      <w:r>
+        <w:rPr>
+          <w:rStyle w:val="SectionNumber"/>
+        </w:rPr>
+        <w:t xml:space="preserve">0.1.4</w:t>
+      </w:r>
+      <w:r>
+        <w:tab/>
+      </w:r>
+      <w:r>
+        <w:rPr>
+          <w:rFonts w:hint="eastAsia"/>
+        </w:rPr>
+        <w:t xml:space="preserve">分析</w:t>
+      </w:r>
+    </w:p>
+    <w:p>
+      <w:pPr>
+        <w:pStyle w:val="FirstParagraph"/>
+      </w:pPr>
+      <w:r>
+        <w:rPr>
+          <w:rFonts w:hint="eastAsia"/>
+        </w:rPr>
+        <w:t xml:space="preserve">该结构适合需要“推导</w:t>
+      </w:r>
+      <w:r>
+        <w:t xml:space="preserve"> + </w:t>
+      </w:r>
+      <w:r>
+        <w:rPr>
+          <w:rFonts w:hint="eastAsia"/>
+        </w:rPr>
+        <w:t xml:space="preserve">算法设计”的小问。推导必须写在解决方式中，问题答案则给出最终可用的公式或判断准则。伪代码只展示算法逻辑，不替代数学推导，也不展开完整源码。</w:t>
+      </w:r>
+    </w:p>
     <w:bookmarkEnd w:id="17"/>
-    <w:bookmarkStart w:id="18" w:name="分析"/>
+    <w:bookmarkEnd w:id="18"/>
+    <w:bookmarkStart w:id="23" w:name="problem-1b数值结果与误差比较"/>
     <w:p>
       <w:pPr>
         <w:pStyle w:val="Heading2"/>
@@ -1419,50 +1461,7 @@
         <w:rPr>
           <w:rStyle w:val="SectionNumber"/>
         </w:rPr>
-        <w:t xml:space="preserve">1.4</w:t>
-      </w:r>
-      <w:r>
-        <w:tab/>
-      </w:r>
-      <w:r>
-        <w:rPr>
-          <w:rFonts w:hint="eastAsia"/>
-        </w:rPr>
-        <w:t xml:space="preserve">分析</w:t>
-      </w:r>
-    </w:p>
-    <w:p>
-      <w:pPr>
-        <w:pStyle w:val="FirstParagraph"/>
-      </w:pPr>
-      <w:r>
-        <w:rPr>
-          <w:rFonts w:hint="eastAsia"/>
-        </w:rPr>
-        <w:t xml:space="preserve">该结构适合需要“推导</w:t>
-      </w:r>
-      <w:r>
-        <w:t xml:space="preserve"> + </w:t>
-      </w:r>
-      <w:r>
-        <w:rPr>
-          <w:rFonts w:hint="eastAsia"/>
-        </w:rPr>
-        <w:t xml:space="preserve">算法设计”的小问。推导必须写在解决方式中，问题答案则给出最终可用的公式或判断准则。伪代码只展示算法逻辑，不替代数学推导，也不展开完整源码。</w:t>
-      </w:r>
-    </w:p>
-    <w:bookmarkEnd w:id="18"/>
-    <w:bookmarkEnd w:id="19"/>
-    <w:bookmarkStart w:id="24" w:name="problem-1b数值结果与误差比较"/>
-    <w:p>
-      <w:pPr>
-        <w:pStyle w:val="Heading1"/>
-      </w:pPr>
-      <w:r>
-        <w:rPr>
-          <w:rStyle w:val="SectionNumber"/>
-        </w:rPr>
-        <w:t xml:space="preserve">2</w:t>
+        <w:t xml:space="preserve">0.2</w:t>
       </w:r>
       <w:r>
         <w:tab/>
@@ -1496,7 +1495,7 @@
           <w:numId w:val="1002"/>
         </w:numPr>
       </w:pPr>
-      <w:hyperlink r:id="rId13">
+      <w:hyperlink r:id="rId12">
         <w:r>
           <w:rPr>
             <w:rStyle w:val="Hyperlink"/>
@@ -1520,7 +1519,7 @@
           <w:numId w:val="1002"/>
         </w:numPr>
       </w:pPr>
-      <w:hyperlink r:id="rId14">
+      <w:hyperlink r:id="rId13">
         <w:r>
           <w:rPr>
             <w:rStyle w:val="Hyperlink"/>
@@ -1529,16 +1528,16 @@
         </w:r>
       </w:hyperlink>
     </w:p>
-    <w:bookmarkStart w:id="20" w:name="待求问题-1"/>
-    <w:p>
-      <w:pPr>
-        <w:pStyle w:val="Heading2"/>
+    <w:bookmarkStart w:id="19" w:name="待求问题-1"/>
+    <w:p>
+      <w:pPr>
+        <w:pStyle w:val="Heading3"/>
       </w:pPr>
       <w:r>
         <w:rPr>
           <w:rStyle w:val="SectionNumber"/>
         </w:rPr>
-        <w:t xml:space="preserve">2.1</w:t>
+        <w:t xml:space="preserve">0.2.1</w:t>
       </w:r>
       <w:r>
         <w:tab/>
@@ -1561,17 +1560,17 @@
         <w:t xml:space="preserve">使用上一小问得到的算法，计算不同步长下的数值结果，并比较误差是否符合理论收敛阶。</w:t>
       </w:r>
     </w:p>
-    <w:bookmarkEnd w:id="20"/>
-    <w:bookmarkStart w:id="21" w:name="解决方式-1"/>
-    <w:p>
-      <w:pPr>
-        <w:pStyle w:val="Heading2"/>
+    <w:bookmarkEnd w:id="19"/>
+    <w:bookmarkStart w:id="20" w:name="解决方式-1"/>
+    <w:p>
+      <w:pPr>
+        <w:pStyle w:val="Heading3"/>
       </w:pPr>
       <w:r>
         <w:rPr>
           <w:rStyle w:val="SectionNumber"/>
         </w:rPr>
-        <w:t xml:space="preserve">2.2</w:t>
+        <w:t xml:space="preserve">0.2.2</w:t>
       </w:r>
       <w:r>
         <w:tab/>
@@ -1661,17 +1660,17 @@
         <w:t xml:space="preserve">。为了便于比较，表格中同时记录参考误差，并观察步长减半后误差是否约缩小为原来的四分之一。</w:t>
       </w:r>
     </w:p>
-    <w:bookmarkEnd w:id="21"/>
-    <w:bookmarkStart w:id="22" w:name="问题答案-1"/>
-    <w:p>
-      <w:pPr>
-        <w:pStyle w:val="Heading2"/>
+    <w:bookmarkEnd w:id="20"/>
+    <w:bookmarkStart w:id="21" w:name="问题答案-1"/>
+    <w:p>
+      <w:pPr>
+        <w:pStyle w:val="Heading3"/>
       </w:pPr>
       <w:r>
         <w:rPr>
           <w:rStyle w:val="SectionNumber"/>
         </w:rPr>
-        <w:t xml:space="preserve">2.3</w:t>
+        <w:t xml:space="preserve">0.2.3</w:t>
       </w:r>
       <w:r>
         <w:tab/>
@@ -2001,42 +2000,43 @@
         <w:t xml:space="preserve">减半时，误差约变为原来的四分之一，因此该数值结果与二阶方法的理论预期一致。</w:t>
       </w:r>
     </w:p>
+    <w:bookmarkEnd w:id="21"/>
+    <w:bookmarkStart w:id="22" w:name="分析-1"/>
+    <w:p>
+      <w:pPr>
+        <w:pStyle w:val="Heading3"/>
+      </w:pPr>
+      <w:r>
+        <w:rPr>
+          <w:rStyle w:val="SectionNumber"/>
+        </w:rPr>
+        <w:t xml:space="preserve">0.2.4</w:t>
+      </w:r>
+      <w:r>
+        <w:tab/>
+      </w:r>
+      <w:r>
+        <w:rPr>
+          <w:rFonts w:hint="eastAsia"/>
+        </w:rPr>
+        <w:t xml:space="preserve">分析</w:t>
+      </w:r>
+    </w:p>
+    <w:p>
+      <w:pPr>
+        <w:pStyle w:val="FirstParagraph"/>
+      </w:pPr>
+      <w:r>
+        <w:rPr>
+          <w:rFonts w:hint="eastAsia"/>
+        </w:rPr>
+        <w:t xml:space="preserve">本小问以表格和定量比较为中心。若有图像，应放在讨论该图的段落附近。文字结论应直接说明“是否符合预期”，并给出依据，而不是只罗列数值。</w:t>
+      </w:r>
+    </w:p>
     <w:bookmarkEnd w:id="22"/>
-    <w:bookmarkStart w:id="23" w:name="分析-1"/>
-    <w:p>
-      <w:pPr>
-        <w:pStyle w:val="Heading2"/>
-      </w:pPr>
-      <w:r>
-        <w:rPr>
-          <w:rStyle w:val="SectionNumber"/>
-        </w:rPr>
-        <w:t xml:space="preserve">2.4</w:t>
-      </w:r>
-      <w:r>
-        <w:tab/>
-      </w:r>
-      <w:r>
-        <w:rPr>
-          <w:rFonts w:hint="eastAsia"/>
-        </w:rPr>
-        <w:t xml:space="preserve">分析</w:t>
-      </w:r>
-    </w:p>
-    <w:p>
-      <w:pPr>
-        <w:pStyle w:val="FirstParagraph"/>
-      </w:pPr>
-      <w:r>
-        <w:rPr>
-          <w:rFonts w:hint="eastAsia"/>
-        </w:rPr>
-        <w:t xml:space="preserve">本小问以表格和定量比较为中心。若有图像，应放在讨论该图的段落附近。文字结论应直接说明“是否符合预期”，并给出依据，而不是只罗列数值。</w:t>
-      </w:r>
-    </w:p>
     <w:bookmarkEnd w:id="23"/>
     <w:bookmarkEnd w:id="24"/>
-    <w:bookmarkStart w:id="25" w:name="ii.-统计检验与对象比较"/>
+    <w:bookmarkStart w:id="37" w:name="ii.-统计检验与对象比较"/>
     <w:p>
       <w:pPr>
         <w:pStyle w:val="Heading1"/>
@@ -2051,17 +2051,16 @@
         <w:t xml:space="preserve">统计检验与对象比较</w:t>
       </w:r>
     </w:p>
-    <w:bookmarkEnd w:id="25"/>
-    <w:bookmarkStart w:id="32" w:name="problem-2a统计量构造"/>
-    <w:p>
-      <w:pPr>
-        <w:pStyle w:val="Heading1"/>
+    <w:bookmarkStart w:id="31" w:name="problem-2a统计量构造"/>
+    <w:p>
+      <w:pPr>
+        <w:pStyle w:val="Heading2"/>
       </w:pPr>
       <w:r>
         <w:rPr>
           <w:rStyle w:val="SectionNumber"/>
         </w:rPr>
-        <w:t xml:space="preserve">3</w:t>
+        <w:t xml:space="preserve">0.3</w:t>
       </w:r>
       <w:r>
         <w:tab/>
@@ -2095,7 +2094,7 @@
           <w:numId w:val="1003"/>
         </w:numPr>
       </w:pPr>
-      <w:hyperlink r:id="rId26">
+      <w:hyperlink r:id="rId25">
         <w:r>
           <w:rPr>
             <w:rStyle w:val="Hyperlink"/>
@@ -2119,7 +2118,7 @@
           <w:numId w:val="1003"/>
         </w:numPr>
       </w:pPr>
-      <w:hyperlink r:id="rId27">
+      <w:hyperlink r:id="rId26">
         <w:r>
           <w:rPr>
             <w:rStyle w:val="Hyperlink"/>
@@ -2128,16 +2127,16 @@
         </w:r>
       </w:hyperlink>
     </w:p>
-    <w:bookmarkStart w:id="28" w:name="待求问题-2"/>
-    <w:p>
-      <w:pPr>
-        <w:pStyle w:val="Heading2"/>
+    <w:bookmarkStart w:id="27" w:name="待求问题-2"/>
+    <w:p>
+      <w:pPr>
+        <w:pStyle w:val="Heading3"/>
       </w:pPr>
       <w:r>
         <w:rPr>
           <w:rStyle w:val="SectionNumber"/>
         </w:rPr>
-        <w:t xml:space="preserve">3.1</w:t>
+        <w:t xml:space="preserve">0.3.1</w:t>
       </w:r>
       <w:r>
         <w:tab/>
@@ -2160,17 +2159,17 @@
         <w:t xml:space="preserve">构造一个统计检验，并说明统计量在理论模型成立时应服从的参考分布。</w:t>
       </w:r>
     </w:p>
-    <w:bookmarkEnd w:id="28"/>
-    <w:bookmarkStart w:id="29" w:name="解决方式-2"/>
-    <w:p>
-      <w:pPr>
-        <w:pStyle w:val="Heading2"/>
+    <w:bookmarkEnd w:id="27"/>
+    <w:bookmarkStart w:id="28" w:name="解决方式-2"/>
+    <w:p>
+      <w:pPr>
+        <w:pStyle w:val="Heading3"/>
       </w:pPr>
       <w:r>
         <w:rPr>
           <w:rStyle w:val="SectionNumber"/>
         </w:rPr>
-        <w:t xml:space="preserve">3.2</w:t>
+        <w:t xml:space="preserve">0.3.2</w:t>
       </w:r>
       <w:r>
         <w:tab/>
@@ -2401,17 +2400,17 @@
         <w:t xml:space="preserve">服从相应自由度的卡方分布。统计量落在分布主体区域，说明观测结果与理论模型较一致；若落在极端尾部，则说明模型假设可能不成立。</w:t>
       </w:r>
     </w:p>
-    <w:bookmarkEnd w:id="29"/>
-    <w:bookmarkStart w:id="30" w:name="问题答案-2"/>
-    <w:p>
-      <w:pPr>
-        <w:pStyle w:val="Heading2"/>
+    <w:bookmarkEnd w:id="28"/>
+    <w:bookmarkStart w:id="29" w:name="问题答案-2"/>
+    <w:p>
+      <w:pPr>
+        <w:pStyle w:val="Heading3"/>
       </w:pPr>
       <w:r>
         <w:rPr>
           <w:rStyle w:val="SectionNumber"/>
         </w:rPr>
-        <w:t xml:space="preserve">3.3</w:t>
+        <w:t xml:space="preserve">0.3.3</w:t>
       </w:r>
       <w:r>
         <w:tab/>
@@ -2582,8 +2581,51 @@
         <w:t xml:space="preserve">值过小表示观测频数与理论频数偏离显著。</w:t>
       </w:r>
     </w:p>
+    <w:bookmarkEnd w:id="29"/>
+    <w:bookmarkStart w:id="30" w:name="分析-2"/>
+    <w:p>
+      <w:pPr>
+        <w:pStyle w:val="Heading3"/>
+      </w:pPr>
+      <w:r>
+        <w:rPr>
+          <w:rStyle w:val="SectionNumber"/>
+        </w:rPr>
+        <w:t xml:space="preserve">0.3.4</w:t>
+      </w:r>
+      <w:r>
+        <w:tab/>
+      </w:r>
+      <w:r>
+        <w:rPr>
+          <w:rFonts w:hint="eastAsia"/>
+        </w:rPr>
+        <w:t xml:space="preserve">分析</w:t>
+      </w:r>
+    </w:p>
+    <w:p>
+      <w:pPr>
+        <w:pStyle w:val="FirstParagraph"/>
+      </w:pPr>
+      <w:r>
+        <w:rPr>
+          <w:rFonts w:hint="eastAsia"/>
+        </w:rPr>
+        <w:t xml:space="preserve">统计量构造类小问应优先讲清楚假设、变量和适用条件。不能只写公式而不说明公式成立的前提；也不能把</w:t>
+      </w:r>
+      <w:r>
+        <w:t xml:space="preserve"> p </w:t>
+      </w:r>
+      <w:r>
+        <w:rPr>
+          <w:rFonts w:hint="eastAsia"/>
+        </w:rPr>
+        <w:t xml:space="preserve">值解释为“模型为真的概率”。</w:t>
+      </w:r>
+    </w:p>
     <w:bookmarkEnd w:id="30"/>
-    <w:bookmarkStart w:id="31" w:name="分析-2"/>
+    <w:bookmarkEnd w:id="31"/>
+    <w:bookmarkStart w:id="36" w:name="problem-2b多对象比较"/>
     <w:p>
       <w:pPr>
         <w:pStyle w:val="Heading2"/>
@@ -2592,50 +2634,7 @@
         <w:rPr>
           <w:rStyle w:val="SectionNumber"/>
         </w:rPr>
-        <w:t xml:space="preserve">3.4</w:t>
-      </w:r>
-      <w:r>
-        <w:tab/>
-      </w:r>
-      <w:r>
-        <w:rPr>
-          <w:rFonts w:hint="eastAsia"/>
-        </w:rPr>
-        <w:t xml:space="preserve">分析</w:t>
-      </w:r>
-    </w:p>
-    <w:p>
-      <w:pPr>
-        <w:pStyle w:val="FirstParagraph"/>
-      </w:pPr>
-      <w:r>
-        <w:rPr>
-          <w:rFonts w:hint="eastAsia"/>
-        </w:rPr>
-        <w:t xml:space="preserve">统计量构造类小问应优先讲清楚假设、变量和适用条件。不能只写公式而不说明公式成立的前提；也不能把</w:t>
-      </w:r>
-      <w:r>
-        <w:t xml:space="preserve"> p </w:t>
-      </w:r>
-      <w:r>
-        <w:rPr>
-          <w:rFonts w:hint="eastAsia"/>
-        </w:rPr>
-        <w:t xml:space="preserve">值解释为“模型为真的概率”。</w:t>
-      </w:r>
-    </w:p>
-    <w:bookmarkEnd w:id="31"/>
-    <w:bookmarkEnd w:id="32"/>
-    <w:bookmarkStart w:id="37" w:name="problem-2b多对象比较"/>
-    <w:p>
-      <w:pPr>
-        <w:pStyle w:val="Heading1"/>
-      </w:pPr>
-      <w:r>
-        <w:rPr>
-          <w:rStyle w:val="SectionNumber"/>
-        </w:rPr>
-        <w:t xml:space="preserve">4</w:t>
+        <w:t xml:space="preserve">0.4</w:t>
       </w:r>
       <w:r>
         <w:tab/>
@@ -2669,7 +2668,7 @@
           <w:numId w:val="1004"/>
         </w:numPr>
       </w:pPr>
-      <w:hyperlink r:id="rId26">
+      <w:hyperlink r:id="rId25">
         <w:r>
           <w:rPr>
             <w:rStyle w:val="Hyperlink"/>
@@ -2693,7 +2692,7 @@
           <w:numId w:val="1004"/>
         </w:numPr>
       </w:pPr>
-      <w:hyperlink r:id="rId27">
+      <w:hyperlink r:id="rId26">
         <w:r>
           <w:rPr>
             <w:rStyle w:val="Hyperlink"/>
@@ -2702,16 +2701,16 @@
         </w:r>
       </w:hyperlink>
     </w:p>
-    <w:bookmarkStart w:id="33" w:name="待求问题-3"/>
-    <w:p>
-      <w:pPr>
-        <w:pStyle w:val="Heading2"/>
+    <w:bookmarkStart w:id="32" w:name="待求问题-3"/>
+    <w:p>
+      <w:pPr>
+        <w:pStyle w:val="Heading3"/>
       </w:pPr>
       <w:r>
         <w:rPr>
           <w:rStyle w:val="SectionNumber"/>
         </w:rPr>
-        <w:t xml:space="preserve">4.1</w:t>
+        <w:t xml:space="preserve">0.4.1</w:t>
       </w:r>
       <w:r>
         <w:tab/>
@@ -2734,59 +2733,59 @@
         <w:t xml:space="preserve">将上一小问的统计检验用于多组对象，比较哪些对象通过检验、哪些对象不通过，并解释主要差异。</w:t>
       </w:r>
     </w:p>
+    <w:bookmarkEnd w:id="32"/>
+    <w:bookmarkStart w:id="33" w:name="解决方式-3"/>
+    <w:p>
+      <w:pPr>
+        <w:pStyle w:val="Heading3"/>
+      </w:pPr>
+      <w:r>
+        <w:rPr>
+          <w:rStyle w:val="SectionNumber"/>
+        </w:rPr>
+        <w:t xml:space="preserve">0.4.2</w:t>
+      </w:r>
+      <w:r>
+        <w:tab/>
+      </w:r>
+      <w:r>
+        <w:rPr>
+          <w:rFonts w:hint="eastAsia"/>
+        </w:rPr>
+        <w:t xml:space="preserve">解决方式</w:t>
+      </w:r>
+    </w:p>
+    <w:p>
+      <w:pPr>
+        <w:pStyle w:val="FirstParagraph"/>
+      </w:pPr>
+      <w:r>
+        <w:rPr>
+          <w:rFonts w:hint="eastAsia"/>
+        </w:rPr>
+        <w:t xml:space="preserve">对每组对象使用相同的分箱方式、样本量和统计量。为保证比较公平，所有对象使用同一判断标准。结果表中应同时给出统计量、自由度、p</w:t>
+      </w:r>
+      <w:r>
+        <w:t xml:space="preserve"> </w:t>
+      </w:r>
+      <w:r>
+        <w:rPr>
+          <w:rFonts w:hint="eastAsia"/>
+        </w:rPr>
+        <w:t xml:space="preserve">值和关键诊断信息。</w:t>
+      </w:r>
+    </w:p>
     <w:bookmarkEnd w:id="33"/>
-    <w:bookmarkStart w:id="34" w:name="解决方式-3"/>
-    <w:p>
-      <w:pPr>
-        <w:pStyle w:val="Heading2"/>
+    <w:bookmarkStart w:id="34" w:name="问题答案-3"/>
+    <w:p>
+      <w:pPr>
+        <w:pStyle w:val="Heading3"/>
       </w:pPr>
       <w:r>
         <w:rPr>
           <w:rStyle w:val="SectionNumber"/>
         </w:rPr>
-        <w:t xml:space="preserve">4.2</w:t>
-      </w:r>
-      <w:r>
-        <w:tab/>
-      </w:r>
-      <w:r>
-        <w:rPr>
-          <w:rFonts w:hint="eastAsia"/>
-        </w:rPr>
-        <w:t xml:space="preserve">解决方式</w:t>
-      </w:r>
-    </w:p>
-    <w:p>
-      <w:pPr>
-        <w:pStyle w:val="FirstParagraph"/>
-      </w:pPr>
-      <w:r>
-        <w:rPr>
-          <w:rFonts w:hint="eastAsia"/>
-        </w:rPr>
-        <w:t xml:space="preserve">对每组对象使用相同的分箱方式、样本量和统计量。为保证比较公平，所有对象使用同一判断标准。结果表中应同时给出统计量、自由度、p</w:t>
-      </w:r>
-      <w:r>
-        <w:t xml:space="preserve"> </w:t>
-      </w:r>
-      <w:r>
-        <w:rPr>
-          <w:rFonts w:hint="eastAsia"/>
-        </w:rPr>
-        <w:t xml:space="preserve">值和关键诊断信息。</w:t>
-      </w:r>
-    </w:p>
-    <w:bookmarkEnd w:id="34"/>
-    <w:bookmarkStart w:id="35" w:name="问题答案-3"/>
-    <w:p>
-      <w:pPr>
-        <w:pStyle w:val="Heading2"/>
-      </w:pPr>
-      <w:r>
-        <w:rPr>
-          <w:rStyle w:val="SectionNumber"/>
-        </w:rPr>
-        <w:t xml:space="preserve">4.3</w:t>
+        <w:t xml:space="preserve">0.4.3</w:t>
       </w:r>
       <w:r>
         <w:tab/>
@@ -3162,39 +3161,40 @@
         <w:t xml:space="preserve">的统计量处于合理范围，但这只说明它们在当前检验设置下没有暴露明显问题。</w:t>
       </w:r>
     </w:p>
+    <w:bookmarkEnd w:id="34"/>
+    <w:bookmarkStart w:id="35" w:name="分析-3"/>
+    <w:p>
+      <w:pPr>
+        <w:pStyle w:val="Heading3"/>
+      </w:pPr>
+      <w:r>
+        <w:rPr>
+          <w:rStyle w:val="SectionNumber"/>
+        </w:rPr>
+        <w:t xml:space="preserve">0.4.4</w:t>
+      </w:r>
+      <w:r>
+        <w:tab/>
+      </w:r>
+      <w:r>
+        <w:rPr>
+          <w:rFonts w:hint="eastAsia"/>
+        </w:rPr>
+        <w:t xml:space="preserve">分析</w:t>
+      </w:r>
+    </w:p>
+    <w:p>
+      <w:pPr>
+        <w:pStyle w:val="FirstParagraph"/>
+      </w:pPr>
+      <w:r>
+        <w:rPr>
+          <w:rFonts w:hint="eastAsia"/>
+        </w:rPr>
+        <w:t xml:space="preserve">多对象比较类小问应避免只给一张表就结束。表格负责呈现证据，正文负责解释证据。若某对象通过了一个弱检验，也只能说明它没有被该检验拒绝，不能据此证明它在所有意义下都可靠。</w:t>
+      </w:r>
+    </w:p>
     <w:bookmarkEnd w:id="35"/>
-    <w:bookmarkStart w:id="36" w:name="分析-3"/>
-    <w:p>
-      <w:pPr>
-        <w:pStyle w:val="Heading2"/>
-      </w:pPr>
-      <w:r>
-        <w:rPr>
-          <w:rStyle w:val="SectionNumber"/>
-        </w:rPr>
-        <w:t xml:space="preserve">4.4</w:t>
-      </w:r>
-      <w:r>
-        <w:tab/>
-      </w:r>
-      <w:r>
-        <w:rPr>
-          <w:rFonts w:hint="eastAsia"/>
-        </w:rPr>
-        <w:t xml:space="preserve">分析</w:t>
-      </w:r>
-    </w:p>
-    <w:p>
-      <w:pPr>
-        <w:pStyle w:val="FirstParagraph"/>
-      </w:pPr>
-      <w:r>
-        <w:rPr>
-          <w:rFonts w:hint="eastAsia"/>
-        </w:rPr>
-        <w:t xml:space="preserve">多对象比较类小问应避免只给一张表就结束。表格负责呈现证据，正文负责解释证据。若某对象通过了一个弱检验，也只能说明它没有被该检验拒绝，不能据此证明它在所有意义下都可靠。</w:t>
-      </w:r>
-    </w:p>
     <w:bookmarkEnd w:id="36"/>
     <w:bookmarkEnd w:id="37"/>
     <w:sectPr>

</xml_diff>